<commit_message>
fix(informes): reparar plantilla de borrador para compatibilidad con Google Docs
</commit_message>
<xml_diff>
--- a/plantillas/INFORME_SUPERVISION_TEMPLATE_BORRADOR.docx
+++ b/plantillas/INFORME_SUPERVISION_TEMPLATE_BORRADOR.docx
@@ -193,7 +193,7 @@
                     </wp:anchor>
                   </w:drawing>
                 </mc:Choice>
-                <mc:Fallback xmlns:cx="http://schemas.microsoft.com/office/drawing/2014/chartex" xmlns:cx1="http://schemas.microsoft.com/office/drawing/2015/9/8/chartex" xmlns:cx2="http://schemas.microsoft.com/office/drawing/2015/10/21/chartex" xmlns:cx3="http://schemas.microsoft.com/office/drawing/2016/5/9/chartex" xmlns:cx4="http://schemas.microsoft.com/office/drawing/2016/5/10/chartex" xmlns:cx5="http://schemas.microsoft.com/office/drawing/2016/5/11/chartex" xmlns:cx6="http://schemas.microsoft.com/office/drawing/2016/5/12/chartex" xmlns:cx7="http://schemas.microsoft.com/office/drawing/2016/5/13/chartex" xmlns:cx8="http://schemas.microsoft.com/office/drawing/2016/5/14/chartex" xmlns:aink="http://schemas.microsoft.com/office/drawing/2016/ink" xmlns:am3d="http://schemas.microsoft.com/office/drawing/2017/model3d" xmlns:oel="http://schemas.microsoft.com/office/2019/extlst" xmlns:w15="http://schemas.microsoft.com/office/word/2012/wordml" xmlns:w16cex="http://schemas.microsoft.com/office/word/2018/wordml/cex" xmlns:w16cid="http://schemas.microsoft.com/office/word/2016/wordml/cid" xmlns:w16="http://schemas.microsoft.com/office/word/2018/wordml" xmlns:w16du="http://schemas.microsoft.com/office/word/2023/wordml/word16du" xmlns:w16sdtdh="http://schemas.microsoft.com/office/word/2020/wordml/sdtdatahash" xmlns:w16sdtfl="http://schemas.microsoft.com/office/word/2024/wordml/sdtformatlock" xmlns:w16se="http://schemas.microsoft.com/office/word/2015/wordml/symex">
+                <mc:Fallback xmlns:w16se="http://schemas.microsoft.com/office/word/2015/wordml/symex" xmlns:w16sdtfl="http://schemas.microsoft.com/office/word/2024/wordml/sdtformatlock" xmlns:w16sdtdh="http://schemas.microsoft.com/office/word/2020/wordml/sdtdatahash" xmlns:w16du="http://schemas.microsoft.com/office/word/2023/wordml/word16du" xmlns:w16="http://schemas.microsoft.com/office/word/2018/wordml" xmlns:w16cid="http://schemas.microsoft.com/office/word/2016/wordml/cid" xmlns:w16cex="http://schemas.microsoft.com/office/word/2018/wordml/cex" xmlns:w15="http://schemas.microsoft.com/office/word/2012/wordml" xmlns:oel="http://schemas.microsoft.com/office/2019/extlst" xmlns:am3d="http://schemas.microsoft.com/office/drawing/2017/model3d" xmlns:aink="http://schemas.microsoft.com/office/drawing/2016/ink" xmlns:cx8="http://schemas.microsoft.com/office/drawing/2016/5/14/chartex" xmlns:cx7="http://schemas.microsoft.com/office/drawing/2016/5/13/chartex" xmlns:cx6="http://schemas.microsoft.com/office/drawing/2016/5/12/chartex" xmlns:cx5="http://schemas.microsoft.com/office/drawing/2016/5/11/chartex" xmlns:cx4="http://schemas.microsoft.com/office/drawing/2016/5/10/chartex" xmlns:cx3="http://schemas.microsoft.com/office/drawing/2016/5/9/chartex" xmlns:cx2="http://schemas.microsoft.com/office/drawing/2015/10/21/chartex" xmlns:cx1="http://schemas.microsoft.com/office/drawing/2015/9/8/chartex" xmlns:cx="http://schemas.microsoft.com/office/drawing/2014/chartex">
                   <w:pict>
                     <v:rect w14:anchorId="6BDD161C" id="Rectangle 2" o:spid="_x0000_s1026" style="position:absolute;left:0;text-align:left;margin-left:355.25pt;margin-top:11.4pt;width:15.75pt;height:14.25pt;z-index:251659264;visibility:visible;mso-wrap-style:square;mso-width-percent:0;mso-height-percent:0;mso-wrap-distance-left:9pt;mso-wrap-distance-top:0;mso-wrap-distance-right:9pt;mso-wrap-distance-bottom:0;mso-position-horizontal:absolute;mso-position-horizontal-relative:text;mso-position-vertical:absolute;mso-position-vertical-relative:text;mso-width-percent:0;mso-height-percent:0;mso-width-relative:page;mso-height-relative:page;v-text-anchor:top" o:gfxdata="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" strokeweight=".26467mm">
                       <v:path arrowok="t"/>
@@ -320,7 +320,7 @@
                     </wp:anchor>
                   </w:drawing>
                 </mc:Choice>
-                <mc:Fallback xmlns:cx="http://schemas.microsoft.com/office/drawing/2014/chartex" xmlns:cx1="http://schemas.microsoft.com/office/drawing/2015/9/8/chartex" xmlns:cx2="http://schemas.microsoft.com/office/drawing/2015/10/21/chartex" xmlns:cx3="http://schemas.microsoft.com/office/drawing/2016/5/9/chartex" xmlns:cx4="http://schemas.microsoft.com/office/drawing/2016/5/10/chartex" xmlns:cx5="http://schemas.microsoft.com/office/drawing/2016/5/11/chartex" xmlns:cx6="http://schemas.microsoft.com/office/drawing/2016/5/12/chartex" xmlns:cx7="http://schemas.microsoft.com/office/drawing/2016/5/13/chartex" xmlns:cx8="http://schemas.microsoft.com/office/drawing/2016/5/14/chartex" xmlns:aink="http://schemas.microsoft.com/office/drawing/2016/ink" xmlns:am3d="http://schemas.microsoft.com/office/drawing/2017/model3d" xmlns:oel="http://schemas.microsoft.com/office/2019/extlst" xmlns:w15="http://schemas.microsoft.com/office/word/2012/wordml" xmlns:w16cex="http://schemas.microsoft.com/office/word/2018/wordml/cex" xmlns:w16cid="http://schemas.microsoft.com/office/word/2016/wordml/cid" xmlns:w16="http://schemas.microsoft.com/office/word/2018/wordml" xmlns:w16du="http://schemas.microsoft.com/office/word/2023/wordml/word16du" xmlns:w16sdtdh="http://schemas.microsoft.com/office/word/2020/wordml/sdtdatahash" xmlns:w16sdtfl="http://schemas.microsoft.com/office/word/2024/wordml/sdtformatlock" xmlns:w16se="http://schemas.microsoft.com/office/word/2015/wordml/symex">
+                <mc:Fallback xmlns:w16se="http://schemas.microsoft.com/office/word/2015/wordml/symex" xmlns:w16sdtfl="http://schemas.microsoft.com/office/word/2024/wordml/sdtformatlock" xmlns:w16sdtdh="http://schemas.microsoft.com/office/word/2020/wordml/sdtdatahash" xmlns:w16du="http://schemas.microsoft.com/office/word/2023/wordml/word16du" xmlns:w16="http://schemas.microsoft.com/office/word/2018/wordml" xmlns:w16cid="http://schemas.microsoft.com/office/word/2016/wordml/cid" xmlns:w16cex="http://schemas.microsoft.com/office/word/2018/wordml/cex" xmlns:w15="http://schemas.microsoft.com/office/word/2012/wordml" xmlns:oel="http://schemas.microsoft.com/office/2019/extlst" xmlns:am3d="http://schemas.microsoft.com/office/drawing/2017/model3d" xmlns:aink="http://schemas.microsoft.com/office/drawing/2016/ink" xmlns:cx8="http://schemas.microsoft.com/office/drawing/2016/5/14/chartex" xmlns:cx7="http://schemas.microsoft.com/office/drawing/2016/5/13/chartex" xmlns:cx6="http://schemas.microsoft.com/office/drawing/2016/5/12/chartex" xmlns:cx5="http://schemas.microsoft.com/office/drawing/2016/5/11/chartex" xmlns:cx4="http://schemas.microsoft.com/office/drawing/2016/5/10/chartex" xmlns:cx3="http://schemas.microsoft.com/office/drawing/2016/5/9/chartex" xmlns:cx2="http://schemas.microsoft.com/office/drawing/2015/10/21/chartex" xmlns:cx1="http://schemas.microsoft.com/office/drawing/2015/9/8/chartex" xmlns:cx="http://schemas.microsoft.com/office/drawing/2014/chartex">
                   <w:pict>
                     <v:rect w14:anchorId="50BD4EA7" id="_x0000_s1027" style="position:absolute;left:0;text-align:left;margin-left:124.35pt;margin-top:11.35pt;width:15.75pt;height:14.25pt;z-index:251657216;visibility:visible;mso-wrap-style:square;mso-width-percent:0;mso-height-percent:0;mso-wrap-distance-left:9pt;mso-wrap-distance-top:0;mso-wrap-distance-right:9pt;mso-wrap-distance-bottom:0;mso-position-horizontal:absolute;mso-position-horizontal-relative:text;mso-position-vertical:absolute;mso-position-vertical-relative:text;mso-width-percent:0;mso-height-percent:0;mso-width-relative:page;mso-height-relative:page;v-text-anchor:top" o:gfxdata="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" strokeweight=".26467mm">
                       <v:path arrowok="t"/>
@@ -3773,12 +3773,8 @@
       </w:pPr>
     </w:p>
     <w:sectPr>
-      <w:headerReference w:type="even" r:id="rId9"/>
-      <w:headerReference w:type="default" r:id="rId10"/>
-      <w:footerReference w:type="even" r:id="rId11"/>
-      <w:footerReference w:type="default" r:id="rId12"/>
-      <w:headerReference w:type="first" r:id="rId13"/>
-      <w:footerReference w:type="first" r:id="rId14"/>
+      <w:headerReference w:type="default" r:id="rId9"/>
+      <w:footerReference w:type="default" r:id="rId10"/>
       <w:pgSz w:w="12242" w:h="15842" w:code="1"/>
       <w:pgMar w:top="1134" w:right="1134" w:bottom="1701" w:left="1134" w:header="1134" w:footer="1134" w:gutter="0"/>
       <w:cols w:space="720"/>
@@ -3807,16 +3803,6 @@
 </file>
 
 <file path=word/footer1.xml><?xml version="1.0" encoding="utf-8"?>
-<w:ftr xmlns:wpc="http://schemas.microsoft.com/office/word/2010/wordprocessingCanvas" xmlns:mc="http://schemas.openxmlformats.org/markup-compatibility/2006" xmlns:o="urn:schemas-microsoft-com:office:office" xmlns:r="http://schemas.openxmlformats.org/officeDocument/2006/relationships" xmlns:m="http://schemas.openxmlformats.org/officeDocument/2006/math" xmlns:v="urn:schemas-microsoft-com:vml" xmlns:wp14="http://schemas.microsoft.com/office/word/2010/wordprocessingDrawing" xmlns:wp="http://schemas.openxmlformats.org/drawingml/2006/wordprocessingDrawing" xmlns:w10="urn:schemas-microsoft-com:office:word" xmlns:w="http://schemas.openxmlformats.org/wordprocessingml/2006/main" xmlns:w14="http://schemas.microsoft.com/office/word/2010/wordml" xmlns:wpg="http://schemas.microsoft.com/office/word/2010/wordprocessingGroup" xmlns:wpi="http://schemas.microsoft.com/office/word/2010/wordprocessingInk" xmlns:wne="http://schemas.microsoft.com/office/word/2006/wordml" xmlns:wps="http://schemas.microsoft.com/office/word/2010/wordprocessingShape" mc:Ignorable="w14 wp14">
-  <w:p>
-    <w:pPr>
-      <w:pStyle w:val="Piedepgina"/>
-    </w:pPr>
-  </w:p>
-</w:ftr>
-</file>
-
-<file path=word/footer2.xml><?xml version="1.0" encoding="utf-8"?>
 <w:ftr xmlns:wpc="http://schemas.microsoft.com/office/word/2010/wordprocessingCanvas" xmlns:mc="http://schemas.openxmlformats.org/markup-compatibility/2006" xmlns:o="urn:schemas-microsoft-com:office:office" xmlns:r="http://schemas.openxmlformats.org/officeDocument/2006/relationships" xmlns:m="http://schemas.openxmlformats.org/officeDocument/2006/math" xmlns:v="urn:schemas-microsoft-com:vml" xmlns:wp14="http://schemas.microsoft.com/office/word/2010/wordprocessingDrawing" xmlns:wp="http://schemas.openxmlformats.org/drawingml/2006/wordprocessingDrawing" xmlns:w10="urn:schemas-microsoft-com:office:word" xmlns:w="http://schemas.openxmlformats.org/wordprocessingml/2006/main" xmlns:w14="http://schemas.microsoft.com/office/word/2010/wordml" xmlns:wpg="http://schemas.microsoft.com/office/word/2010/wordprocessingGroup" xmlns:wpi="http://schemas.microsoft.com/office/word/2010/wordprocessingInk" xmlns:wne="http://schemas.microsoft.com/office/word/2006/wordml" xmlns:wps="http://schemas.microsoft.com/office/word/2010/wordprocessingShape" mc:Ignorable="w14 wp14">
   <w:p>
     <w:pPr>
@@ -3896,7 +3882,7 @@
         <w:sz w:val="16"/>
         <w:szCs w:val="16"/>
       </w:rPr>
-      <w:t>2</w:t>
+      <w:t>1</w:t>
     </w:r>
     <w:r>
       <w:rPr>
@@ -3959,16 +3945,6 @@
 </w:ftr>
 </file>
 
-<file path=word/footer3.xml><?xml version="1.0" encoding="utf-8"?>
-<w:ftr xmlns:wpc="http://schemas.microsoft.com/office/word/2010/wordprocessingCanvas" xmlns:mc="http://schemas.openxmlformats.org/markup-compatibility/2006" xmlns:o="urn:schemas-microsoft-com:office:office" xmlns:r="http://schemas.openxmlformats.org/officeDocument/2006/relationships" xmlns:m="http://schemas.openxmlformats.org/officeDocument/2006/math" xmlns:v="urn:schemas-microsoft-com:vml" xmlns:wp14="http://schemas.microsoft.com/office/word/2010/wordprocessingDrawing" xmlns:wp="http://schemas.openxmlformats.org/drawingml/2006/wordprocessingDrawing" xmlns:w10="urn:schemas-microsoft-com:office:word" xmlns:w="http://schemas.openxmlformats.org/wordprocessingml/2006/main" xmlns:w14="http://schemas.microsoft.com/office/word/2010/wordml" xmlns:wpg="http://schemas.microsoft.com/office/word/2010/wordprocessingGroup" xmlns:wpi="http://schemas.microsoft.com/office/word/2010/wordprocessingInk" xmlns:wne="http://schemas.microsoft.com/office/word/2006/wordml" xmlns:wps="http://schemas.microsoft.com/office/word/2010/wordprocessingShape" mc:Ignorable="w14 wp14">
-  <w:p>
-    <w:pPr>
-      <w:pStyle w:val="Piedepgina"/>
-    </w:pPr>
-  </w:p>
-</w:ftr>
-</file>
-
 <file path=word/footnotes.xml><?xml version="1.0" encoding="utf-8"?>
 <w:footnotes xmlns:wpc="http://schemas.microsoft.com/office/word/2010/wordprocessingCanvas" xmlns:mc="http://schemas.openxmlformats.org/markup-compatibility/2006" xmlns:o="urn:schemas-microsoft-com:office:office" xmlns:r="http://schemas.openxmlformats.org/officeDocument/2006/relationships" xmlns:m="http://schemas.openxmlformats.org/officeDocument/2006/math" xmlns:v="urn:schemas-microsoft-com:vml" xmlns:wp14="http://schemas.microsoft.com/office/word/2010/wordprocessingDrawing" xmlns:wp="http://schemas.openxmlformats.org/drawingml/2006/wordprocessingDrawing" xmlns:w10="urn:schemas-microsoft-com:office:word" xmlns:w="http://schemas.openxmlformats.org/wordprocessingml/2006/main" xmlns:w14="http://schemas.microsoft.com/office/word/2010/wordml" xmlns:wpg="http://schemas.microsoft.com/office/word/2010/wordprocessingGroup" xmlns:wpi="http://schemas.microsoft.com/office/word/2010/wordprocessingInk" xmlns:wne="http://schemas.microsoft.com/office/word/2006/wordml" xmlns:wps="http://schemas.microsoft.com/office/word/2010/wordprocessingShape" mc:Ignorable="w14 wp14">
   <w:footnote w:type="separator" w:id="-1">
@@ -3992,52 +3968,6 @@
 </file>
 
 <file path=word/header1.xml><?xml version="1.0" encoding="utf-8"?>
-<w:hdr xmlns:wpc="http://schemas.microsoft.com/office/word/2010/wordprocessingCanvas" xmlns:mc="http://schemas.openxmlformats.org/markup-compatibility/2006" xmlns:o="urn:schemas-microsoft-com:office:office" xmlns:r="http://schemas.openxmlformats.org/officeDocument/2006/relationships" xmlns:m="http://schemas.openxmlformats.org/officeDocument/2006/math" xmlns:v="urn:schemas-microsoft-com:vml" xmlns:wp14="http://schemas.microsoft.com/office/word/2010/wordprocessingDrawing" xmlns:wp="http://schemas.openxmlformats.org/drawingml/2006/wordprocessingDrawing" xmlns:w10="urn:schemas-microsoft-com:office:word" xmlns:w="http://schemas.openxmlformats.org/wordprocessingml/2006/main" xmlns:w14="http://schemas.microsoft.com/office/word/2010/wordml" xmlns:wpg="http://schemas.microsoft.com/office/word/2010/wordprocessingGroup" xmlns:wpi="http://schemas.microsoft.com/office/word/2010/wordprocessingInk" xmlns:wne="http://schemas.microsoft.com/office/word/2006/wordml" xmlns:wps="http://schemas.microsoft.com/office/word/2010/wordprocessingShape" mc:Ignorable="w14 wp14">
-  <w:p>
-    <w:pPr>
-      <w:pStyle w:val="Encabezado"/>
-    </w:pPr>
-    <w:r>
-      <w:rPr>
-        <w:noProof/>
-      </w:rPr>
-      <w:pict w14:anchorId="5B60B046">
-        <v:shapetype id="_x0000_t136" coordsize="21600,21600" o:spt="136" adj="10800" path="m@7,l@8,m@5,21600l@6,21600e">
-          <v:formulas>
-            <v:f eqn="sum #0 0 10800"/>
-            <v:f eqn="prod #0 2 1"/>
-            <v:f eqn="sum 21600 0 @1"/>
-            <v:f eqn="sum 0 0 @2"/>
-            <v:f eqn="sum 21600 0 @3"/>
-            <v:f eqn="if @0 @3 0"/>
-            <v:f eqn="if @0 21600 @1"/>
-            <v:f eqn="if @0 0 @2"/>
-            <v:f eqn="if @0 @4 21600"/>
-            <v:f eqn="mid @5 @6"/>
-            <v:f eqn="mid @8 @5"/>
-            <v:f eqn="mid @7 @8"/>
-            <v:f eqn="mid @6 @7"/>
-            <v:f eqn="sum @6 0 @5"/>
-          </v:formulas>
-          <v:path textpathok="t" o:connecttype="custom" o:connectlocs="@9,0;@10,10800;@11,21600;@12,10800" o:connectangles="270,180,90,0"/>
-          <v:textpath on="t" fitshape="t"/>
-          <v:handles>
-            <v:h position="#0,bottomRight" xrange="6629,14971"/>
-          </v:handles>
-          <o:lock v:ext="edit" text="t" shapetype="t"/>
-        </v:shapetype>
-        <v:shape id="PowerPlusWaterMarkObject1045990922" o:spid="_x0000_s2050" type="#_x0000_t136" style="position:absolute;margin-left:0;margin-top:0;width:562.5pt;height:140.6pt;rotation:315;z-index:-251655168;mso-position-horizontal:center;mso-position-horizontal-relative:margin;mso-position-vertical:center;mso-position-vertical-relative:margin" o:allowincell="f" fillcolor="#c0504d [3205]" stroked="f">
-          <v:fill opacity=".5"/>
-          <v:textpath style="font-family:&quot;Times New Roman&quot;;font-size:1pt" string="BORRADOR"/>
-          <w10:wrap anchorx="margin" anchory="margin"/>
-        </v:shape>
-      </w:pict>
-    </w:r>
-  </w:p>
-</w:hdr>
-</file>
-
-<file path=word/header2.xml><?xml version="1.0" encoding="utf-8"?>
 <w:hdr xmlns:wpc="http://schemas.microsoft.com/office/word/2010/wordprocessingCanvas" xmlns:mc="http://schemas.openxmlformats.org/markup-compatibility/2006" xmlns:o="urn:schemas-microsoft-com:office:office" xmlns:r="http://schemas.openxmlformats.org/officeDocument/2006/relationships" xmlns:m="http://schemas.openxmlformats.org/officeDocument/2006/math" xmlns:v="urn:schemas-microsoft-com:vml" xmlns:wp14="http://schemas.microsoft.com/office/word/2010/wordprocessingDrawing" xmlns:wp="http://schemas.openxmlformats.org/drawingml/2006/wordprocessingDrawing" xmlns:w10="urn:schemas-microsoft-com:office:word" xmlns:w="http://schemas.openxmlformats.org/wordprocessingml/2006/main" xmlns:w14="http://schemas.microsoft.com/office/word/2010/wordml" xmlns:wpg="http://schemas.microsoft.com/office/word/2010/wordprocessingGroup" xmlns:wpi="http://schemas.microsoft.com/office/word/2010/wordprocessingInk" xmlns:wne="http://schemas.microsoft.com/office/word/2006/wordml" xmlns:wps="http://schemas.microsoft.com/office/word/2010/wordprocessingShape" mc:Ignorable="w14 wp14">
   <w:tbl>
     <w:tblPr>
@@ -4080,42 +4010,6 @@
               <w:lang w:eastAsia="es-CO"/>
             </w:rPr>
           </w:pPr>
-          <w:r>
-            <w:rPr>
-              <w:noProof/>
-            </w:rPr>
-            <w:pict w14:anchorId="4639C1B0">
-              <v:shapetype id="_x0000_t136" coordsize="21600,21600" o:spt="136" adj="10800" path="m@7,l@8,m@5,21600l@6,21600e">
-                <v:formulas>
-                  <v:f eqn="sum #0 0 10800"/>
-                  <v:f eqn="prod #0 2 1"/>
-                  <v:f eqn="sum 21600 0 @1"/>
-                  <v:f eqn="sum 0 0 @2"/>
-                  <v:f eqn="sum 21600 0 @3"/>
-                  <v:f eqn="if @0 @3 0"/>
-                  <v:f eqn="if @0 21600 @1"/>
-                  <v:f eqn="if @0 0 @2"/>
-                  <v:f eqn="if @0 @4 21600"/>
-                  <v:f eqn="mid @5 @6"/>
-                  <v:f eqn="mid @8 @5"/>
-                  <v:f eqn="mid @7 @8"/>
-                  <v:f eqn="mid @6 @7"/>
-                  <v:f eqn="sum @6 0 @5"/>
-                </v:formulas>
-                <v:path textpathok="t" o:connecttype="custom" o:connectlocs="@9,0;@10,10800;@11,21600;@12,10800" o:connectangles="270,180,90,0"/>
-                <v:textpath on="t" fitshape="t"/>
-                <v:handles>
-                  <v:h position="#0,bottomRight" xrange="6629,14971"/>
-                </v:handles>
-                <o:lock v:ext="edit" text="t" shapetype="t"/>
-              </v:shapetype>
-              <v:shape id="PowerPlusWaterMarkObject1045990923" o:spid="_x0000_s2051" type="#_x0000_t136" style="position:absolute;left:0;text-align:left;margin-left:0;margin-top:0;width:562.5pt;height:140.6pt;rotation:315;z-index:-251653120;mso-position-horizontal:center;mso-position-horizontal-relative:margin;mso-position-vertical:center;mso-position-vertical-relative:margin" o:allowincell="f" fillcolor="#c0504d [3205]" stroked="f">
-                <v:fill opacity=".5"/>
-                <v:textpath style="font-family:&quot;Times New Roman&quot;;font-size:1pt" string="BORRADOR"/>
-                <w10:wrap anchorx="margin" anchory="margin"/>
-              </v:shape>
-            </w:pict>
-          </w:r>
           <w:r>
             <w:rPr>
               <w:noProof/>
@@ -4441,11 +4335,6 @@
       <w:pStyle w:val="Encabezado"/>
     </w:pPr>
   </w:p>
-</w:hdr>
-</file>
-
-<file path=word/header3.xml><?xml version="1.0" encoding="utf-8"?>
-<w:hdr xmlns:wpc="http://schemas.microsoft.com/office/word/2010/wordprocessingCanvas" xmlns:mc="http://schemas.openxmlformats.org/markup-compatibility/2006" xmlns:o="urn:schemas-microsoft-com:office:office" xmlns:r="http://schemas.openxmlformats.org/officeDocument/2006/relationships" xmlns:m="http://schemas.openxmlformats.org/officeDocument/2006/math" xmlns:v="urn:schemas-microsoft-com:vml" xmlns:wp14="http://schemas.microsoft.com/office/word/2010/wordprocessingDrawing" xmlns:wp="http://schemas.openxmlformats.org/drawingml/2006/wordprocessingDrawing" xmlns:w10="urn:schemas-microsoft-com:office:word" xmlns:w="http://schemas.openxmlformats.org/wordprocessingml/2006/main" xmlns:w14="http://schemas.microsoft.com/office/word/2010/wordml" xmlns:wpg="http://schemas.microsoft.com/office/word/2010/wordprocessingGroup" xmlns:wpi="http://schemas.microsoft.com/office/word/2010/wordprocessingInk" xmlns:wne="http://schemas.microsoft.com/office/word/2006/wordml" xmlns:wps="http://schemas.microsoft.com/office/word/2010/wordprocessingShape" mc:Ignorable="w14 wp14">
   <w:p>
     <w:pPr>
       <w:pStyle w:val="Encabezado"/>
@@ -4454,7 +4343,7 @@
       <w:rPr>
         <w:noProof/>
       </w:rPr>
-      <w:pict w14:anchorId="6CB4A4FA">
+      <w:pict>
         <v:shapetype id="_x0000_t136" coordsize="21600,21600" o:spt="136" adj="10800" path="m@7,l@8,m@5,21600l@6,21600e">
           <v:formulas>
             <v:f eqn="sum #0 0 10800"/>
@@ -4479,9 +4368,9 @@
           </v:handles>
           <o:lock v:ext="edit" text="t" shapetype="t"/>
         </v:shapetype>
-        <v:shape id="PowerPlusWaterMarkObject1045990921" o:spid="_x0000_s2049" type="#_x0000_t136" style="position:absolute;margin-left:0;margin-top:0;width:562.5pt;height:140.6pt;rotation:315;z-index:-251657216;mso-position-horizontal:center;mso-position-horizontal-relative:margin;mso-position-vertical:center;mso-position-vertical-relative:margin" o:allowincell="f" fillcolor="#c0504d [3205]" stroked="f">
-          <v:fill opacity=".5"/>
-          <v:textpath style="font-family:&quot;Times New Roman&quot;;font-size:1pt" string="BORRADOR"/>
+        <v:shape id="WaterMarkBorrador" o:spid="_x0000_s2050" type="#_x0000_t136" style="position:absolute;margin-left:0;margin-top:0;width:562.5pt;height:140.6pt;rotation:315;z-index:-251658240;mso-position-horizontal:center;mso-position-horizontal-relative:margin;mso-position-vertical:center;mso-position-vertical-relative:margin" o:allowincell="f" fillcolor="#d0d0d0" stroked="f">
+          <v:fill opacity=".4"/>
+          <v:textpath style="font-family:&quot;Arial&quot;;font-size:1pt" string="BORRADOR"/>
           <w10:wrap anchorx="margin" anchory="margin"/>
         </v:shape>
       </w:pict>
@@ -6301,7 +6190,7 @@
 </file>
 
 <file path=customXml/itemProps1.xml><?xml version="1.0" encoding="utf-8"?>
-<ds:datastoreItem xmlns:ds="http://schemas.openxmlformats.org/officeDocument/2006/customXml" ds:itemID="{E32EE2E5-FCEE-4432-BF4D-DCB390624CBE}">
+<ds:datastoreItem xmlns:ds="http://schemas.openxmlformats.org/officeDocument/2006/customXml" ds:itemID="{9A0C0756-1091-431D-BC2F-58E47DAE277E}">
   <ds:schemaRefs>
     <ds:schemaRef ds:uri="http://schemas.openxmlformats.org/officeDocument/2006/bibliography"/>
   </ds:schemaRefs>

</xml_diff>